<commit_message>
Replace draft report with final report
</commit_message>
<xml_diff>
--- a/PROG101_Assignment1_CleanFreetown.docx
+++ b/PROG101_Assignment1_CleanFreetown.docx
@@ -7,6 +7,8 @@
         <w:spacing w:before="600" w:after="200"/>
         <w:jc w:val="center"/>
       </w:pPr>
+      <w:bookmarkStart w:id="0" w:name="_GoBack"/>
+      <w:bookmarkEnd w:id="0"/>
       <w:r>
         <w:rPr>
           <w:b/>
@@ -184,12 +186,6 @@
         <w:gridCol w:w="6652"/>
       </w:tblGrid>
       <w:tr>
-        <w:tblPrEx>
-          <w:tblCellMar>
-            <w:top w:w="0" w:type="dxa"/>
-            <w:bottom w:w="0" w:type="dxa"/>
-          </w:tblCellMar>
-        </w:tblPrEx>
         <w:trPr>
           <w:trHeight w:val="284"/>
           <w:tblHeader/>
@@ -260,12 +256,6 @@
         </w:tc>
       </w:tr>
       <w:tr>
-        <w:tblPrEx>
-          <w:tblCellMar>
-            <w:top w:w="0" w:type="dxa"/>
-            <w:bottom w:w="0" w:type="dxa"/>
-          </w:tblCellMar>
-        </w:tblPrEx>
         <w:trPr>
           <w:cantSplit/>
           <w:trHeight w:val="274"/>
@@ -324,12 +314,6 @@
         </w:tc>
       </w:tr>
       <w:tr>
-        <w:tblPrEx>
-          <w:tblCellMar>
-            <w:top w:w="0" w:type="dxa"/>
-            <w:bottom w:w="0" w:type="dxa"/>
-          </w:tblCellMar>
-        </w:tblPrEx>
         <w:trPr>
           <w:cantSplit/>
           <w:trHeight w:val="284"/>
@@ -390,12 +374,6 @@
         </w:tc>
       </w:tr>
       <w:tr>
-        <w:tblPrEx>
-          <w:tblCellMar>
-            <w:top w:w="0" w:type="dxa"/>
-            <w:bottom w:w="0" w:type="dxa"/>
-          </w:tblCellMar>
-        </w:tblPrEx>
         <w:trPr>
           <w:cantSplit/>
           <w:trHeight w:val="284"/>
@@ -456,12 +434,6 @@
         </w:tc>
       </w:tr>
       <w:tr>
-        <w:tblPrEx>
-          <w:tblCellMar>
-            <w:top w:w="0" w:type="dxa"/>
-            <w:bottom w:w="0" w:type="dxa"/>
-          </w:tblCellMar>
-        </w:tblPrEx>
         <w:trPr>
           <w:cantSplit/>
           <w:trHeight w:val="284"/>
@@ -527,12 +499,6 @@
         </w:tc>
       </w:tr>
       <w:tr>
-        <w:tblPrEx>
-          <w:tblCellMar>
-            <w:top w:w="0" w:type="dxa"/>
-            <w:bottom w:w="0" w:type="dxa"/>
-          </w:tblCellMar>
-        </w:tblPrEx>
         <w:trPr>
           <w:cantSplit/>
           <w:trHeight w:val="274"/>
@@ -591,12 +557,6 @@
         </w:tc>
       </w:tr>
       <w:tr>
-        <w:tblPrEx>
-          <w:tblCellMar>
-            <w:top w:w="0" w:type="dxa"/>
-            <w:bottom w:w="0" w:type="dxa"/>
-          </w:tblCellMar>
-        </w:tblPrEx>
         <w:trPr>
           <w:cantSplit/>
           <w:trHeight w:val="284"/>
@@ -657,12 +617,6 @@
         </w:tc>
       </w:tr>
       <w:tr>
-        <w:tblPrEx>
-          <w:tblCellMar>
-            <w:top w:w="0" w:type="dxa"/>
-            <w:bottom w:w="0" w:type="dxa"/>
-          </w:tblCellMar>
-        </w:tblPrEx>
         <w:trPr>
           <w:cantSplit/>
           <w:trHeight w:val="284"/>
@@ -737,6 +691,7 @@
         <w:alias w:val="Table of Contents"/>
         <w:id w:val="1470247720"/>
       </w:sdtPr>
+      <w:sdtEndPr/>
       <w:sdtContent>
         <w:p>
           <w:pPr>
@@ -2406,84 +2361,20 @@
         <w:pStyle w:val="Heading1"/>
         <w:pageBreakBefore/>
       </w:pPr>
-      <w:bookmarkStart w:id="0" w:name="_Toc241911181"/>
+      <w:bookmarkStart w:id="1" w:name="_Toc241911181"/>
       <w:r>
         <w:lastRenderedPageBreak/>
         <w:t>1. RATIONALE</w:t>
       </w:r>
-      <w:bookmarkEnd w:id="0"/>
+      <w:bookmarkEnd w:id="1"/>
     </w:p>
     <w:p>
       <w:pPr>
         <w:pStyle w:val="Heading2"/>
       </w:pPr>
-      <w:bookmarkStart w:id="1" w:name="_Toc241911182"/>
+      <w:bookmarkStart w:id="2" w:name="_Toc241911182"/>
       <w:r>
         <w:t>1.1 Problem Description</w:t>
-      </w:r>
-      <w:bookmarkEnd w:id="1"/>
-    </w:p>
-    <w:p>
-      <w:pPr>
-        <w:spacing w:after="120"/>
-      </w:pPr>
-      <w:r>
-        <w:t>Waste management is one of the most visible community problems in Sierra Leone, particularly in Freetown. Households, markets and informal settlements produce waste daily, but collection is irregular and there is no simple, reliable channel through which residents can tell the authorities that a bin or dumping point is full. As a result, waste piles up in streets, drains and open spaces.</w:t>
-      </w:r>
-    </w:p>
-    <w:p>
-      <w:pPr>
-        <w:spacing w:after="120"/>
-      </w:pPr>
-      <w:r>
-        <w:rPr>
-          <w:b/>
-          <w:bCs/>
-        </w:rPr>
-        <w:t xml:space="preserve">Who is affected? </w:t>
-      </w:r>
-      <w:r>
-        <w:t xml:space="preserve">Residents of densely populated and low-lying communities (for example </w:t>
-      </w:r>
-      <w:proofErr w:type="spellStart"/>
-      <w:r>
-        <w:t>Kroo</w:t>
-      </w:r>
-      <w:proofErr w:type="spellEnd"/>
-      <w:r>
-        <w:t xml:space="preserve"> Bay, Congo Town and Wellington), market traders, children, schools and clinics near dumping sites, and the city council and collection teams who must plan routes without reliable information.</w:t>
-      </w:r>
-    </w:p>
-    <w:p>
-      <w:pPr>
-        <w:spacing w:after="120"/>
-      </w:pPr>
-      <w:r>
-        <w:rPr>
-          <w:b/>
-          <w:bCs/>
-        </w:rPr>
-        <w:t xml:space="preserve">Why does the problem exist? </w:t>
-      </w:r>
-      <w:r>
-        <w:t xml:space="preserve">Collection trucks and workers are limited, routes are often planned without knowing which areas are most urgent, residents have no easy way to report overflowing waste, and there is no record of how often each area is serviced. Reporting is mostly verbal or by phone call, which is slow, easily forgotten and impossible to </w:t>
-      </w:r>
-      <w:proofErr w:type="spellStart"/>
-      <w:r>
-        <w:t>analyse</w:t>
-      </w:r>
-      <w:proofErr w:type="spellEnd"/>
-      <w:r>
-        <w:t>.</w:t>
-      </w:r>
-    </w:p>
-    <w:p>
-      <w:pPr>
-        <w:pStyle w:val="Heading2"/>
-      </w:pPr>
-      <w:bookmarkStart w:id="2" w:name="_Toc241911183"/>
-      <w:r>
-        <w:t>1.2 Background</w:t>
       </w:r>
       <w:bookmarkEnd w:id="2"/>
     </w:p>
@@ -2492,7 +2383,7 @@
         <w:spacing w:after="120"/>
       </w:pPr>
       <w:r>
-        <w:t>Freetown has a high population density, a rainy season that brings heavy rainfall, and many settlements built on low ground or steep hillsides. When waste blocks drains and waterways, flooding becomes more severe and standing dirty water increases the risk of waterborne diseases such as cholera and typhoid. Previous flooding and cholera events in the country have shown how closely sanitation, waste and public health are linked. Cleanliness efforts by the council and community groups are limited by resources and by a lack of data on where waste problems are worst.</w:t>
+        <w:t>Waste management is one of the most visible community problems in Sierra Leone, particularly in Freetown. Households, markets and informal settlements produce waste daily, but collection is irregular and there is no simple, reliable channel through which residents can tell the authorities that a bin or dumping point is full. As a result, waste piles up in streets, drains and open spaces.</w:t>
       </w:r>
     </w:p>
     <w:p>
@@ -2500,26 +2391,90 @@
         <w:spacing w:after="120"/>
       </w:pPr>
       <w:r>
-        <w:t>Because many residents have access to a basic mobile phone, a simple report-and-</w:t>
+        <w:rPr>
+          <w:b/>
+          <w:bCs/>
+        </w:rPr>
+        <w:t xml:space="preserve">Who is affected? </w:t>
+      </w:r>
+      <w:r>
+        <w:t xml:space="preserve">Residents of densely populated and low-lying communities (for example </w:t>
       </w:r>
       <w:proofErr w:type="spellStart"/>
       <w:r>
-        <w:t>prioritise</w:t>
+        <w:t>Kroo</w:t>
       </w:r>
       <w:proofErr w:type="spellEnd"/>
       <w:r>
-        <w:t xml:space="preserve"> system built around short inputs is realistic. This assignment does not build the program; it designs the complete logic so developers can later implement it in any language.</w:t>
+        <w:t xml:space="preserve"> Bay, Congo Town and Wellington), market traders, children, schools and clinics near dumping sites, and the city council and collection teams who must plan routes without reliable information.</w:t>
+      </w:r>
+    </w:p>
+    <w:p>
+      <w:pPr>
+        <w:spacing w:after="120"/>
+      </w:pPr>
+      <w:r>
+        <w:rPr>
+          <w:b/>
+          <w:bCs/>
+        </w:rPr>
+        <w:t xml:space="preserve">Why does the problem exist? </w:t>
+      </w:r>
+      <w:r>
+        <w:t xml:space="preserve">Collection trucks and workers are limited, routes are often planned without knowing which areas are most urgent, residents have no easy way to report overflowing waste, and there is no record of how often each area is serviced. Reporting is mostly verbal or by phone call, which is slow, easily forgotten and impossible to </w:t>
+      </w:r>
+      <w:proofErr w:type="spellStart"/>
+      <w:r>
+        <w:t>analyse</w:t>
+      </w:r>
+      <w:proofErr w:type="spellEnd"/>
+      <w:r>
+        <w:t>.</w:t>
       </w:r>
     </w:p>
     <w:p>
       <w:pPr>
         <w:pStyle w:val="Heading2"/>
       </w:pPr>
-      <w:bookmarkStart w:id="3" w:name="_Toc241911184"/>
+      <w:bookmarkStart w:id="3" w:name="_Toc241911183"/>
+      <w:r>
+        <w:t>1.2 Background</w:t>
+      </w:r>
+      <w:bookmarkEnd w:id="3"/>
+    </w:p>
+    <w:p>
+      <w:pPr>
+        <w:spacing w:after="120"/>
+      </w:pPr>
+      <w:r>
+        <w:t>Freetown has a high population density, a rainy season that brings heavy rainfall, and many settlements built on low ground or steep hillsides. When waste blocks drains and waterways, flooding becomes more severe and standing dirty water increases the risk of waterborne diseases such as cholera and typhoid. Previous flooding and cholera events in the country have shown how closely sanitation, waste and public health are linked. Cleanliness efforts by the council and community groups are limited by resources and by a lack of data on where waste problems are worst.</w:t>
+      </w:r>
+    </w:p>
+    <w:p>
+      <w:pPr>
+        <w:spacing w:after="120"/>
+      </w:pPr>
+      <w:r>
+        <w:t>Because many residents have access to a basic mobile phone, a simple report-and-</w:t>
+      </w:r>
+      <w:proofErr w:type="spellStart"/>
+      <w:r>
+        <w:t>prioritise</w:t>
+      </w:r>
+      <w:proofErr w:type="spellEnd"/>
+      <w:r>
+        <w:t xml:space="preserve"> system built around short inputs is realistic. This assignment does not build the program; it designs the complete logic so developers can later implement it in any language.</w:t>
+      </w:r>
+    </w:p>
+    <w:p>
+      <w:pPr>
+        <w:pStyle w:val="Heading2"/>
+      </w:pPr>
+      <w:bookmarkStart w:id="4" w:name="_Toc241911184"/>
       <w:r>
         <w:t>1.3 Community Impact</w:t>
       </w:r>
-      <w:bookmarkEnd w:id="3"/>
+      <w:bookmarkEnd w:id="4"/>
     </w:p>
     <w:p>
       <w:pPr>
@@ -2613,11 +2568,11 @@
       <w:pPr>
         <w:pStyle w:val="Heading2"/>
       </w:pPr>
-      <w:bookmarkStart w:id="4" w:name="_Toc241911185"/>
+      <w:bookmarkStart w:id="5" w:name="_Toc241911185"/>
       <w:r>
         <w:t>1.4 Proposed Solution</w:t>
       </w:r>
-      <w:bookmarkEnd w:id="4"/>
+      <w:bookmarkEnd w:id="5"/>
     </w:p>
     <w:p>
       <w:pPr>
@@ -2636,11 +2591,11 @@
       <w:pPr>
         <w:pStyle w:val="Heading2"/>
       </w:pPr>
-      <w:bookmarkStart w:id="5" w:name="_Toc241911186"/>
+      <w:bookmarkStart w:id="6" w:name="_Toc241911186"/>
       <w:r>
         <w:t>1.5 Computational Thinking Process</w:t>
       </w:r>
-      <w:bookmarkEnd w:id="5"/>
+      <w:bookmarkEnd w:id="6"/>
     </w:p>
     <w:tbl>
       <w:tblPr>
@@ -2665,12 +2620,6 @@
         <w:gridCol w:w="7538"/>
       </w:tblGrid>
       <w:tr>
-        <w:tblPrEx>
-          <w:tblCellMar>
-            <w:top w:w="0" w:type="dxa"/>
-            <w:bottom w:w="0" w:type="dxa"/>
-          </w:tblCellMar>
-        </w:tblPrEx>
         <w:trPr>
           <w:tblHeader/>
         </w:trPr>
@@ -2750,12 +2699,6 @@
         </w:tc>
       </w:tr>
       <w:tr>
-        <w:tblPrEx>
-          <w:tblCellMar>
-            <w:top w:w="0" w:type="dxa"/>
-            <w:bottom w:w="0" w:type="dxa"/>
-          </w:tblCellMar>
-        </w:tblPrEx>
         <w:trPr>
           <w:cantSplit/>
         </w:trPr>
@@ -2813,12 +2756,6 @@
         </w:tc>
       </w:tr>
       <w:tr>
-        <w:tblPrEx>
-          <w:tblCellMar>
-            <w:top w:w="0" w:type="dxa"/>
-            <w:bottom w:w="0" w:type="dxa"/>
-          </w:tblCellMar>
-        </w:tblPrEx>
         <w:trPr>
           <w:cantSplit/>
         </w:trPr>
@@ -2879,12 +2816,6 @@
         </w:tc>
       </w:tr>
       <w:tr>
-        <w:tblPrEx>
-          <w:tblCellMar>
-            <w:top w:w="0" w:type="dxa"/>
-            <w:bottom w:w="0" w:type="dxa"/>
-          </w:tblCellMar>
-        </w:tblPrEx>
         <w:trPr>
           <w:cantSplit/>
         </w:trPr>
@@ -2942,12 +2873,6 @@
         </w:tc>
       </w:tr>
       <w:tr>
-        <w:tblPrEx>
-          <w:tblCellMar>
-            <w:top w:w="0" w:type="dxa"/>
-            <w:bottom w:w="0" w:type="dxa"/>
-          </w:tblCellMar>
-        </w:tblPrEx>
         <w:trPr>
           <w:cantSplit/>
         </w:trPr>
@@ -3032,11 +2957,11 @@
       <w:pPr>
         <w:pStyle w:val="Heading2"/>
       </w:pPr>
-      <w:bookmarkStart w:id="6" w:name="_Toc241911187"/>
+      <w:bookmarkStart w:id="7" w:name="_Toc241911187"/>
       <w:r>
         <w:t>1.6 Algorithm Design</w:t>
       </w:r>
-      <w:bookmarkEnd w:id="6"/>
+      <w:bookmarkEnd w:id="7"/>
     </w:p>
     <w:p>
       <w:pPr>
@@ -3082,11 +3007,11 @@
       <w:pPr>
         <w:pStyle w:val="Heading2"/>
       </w:pPr>
-      <w:bookmarkStart w:id="7" w:name="_Toc241911188"/>
+      <w:bookmarkStart w:id="8" w:name="_Toc241911188"/>
       <w:r>
         <w:t>1.7 SDG Alignment</w:t>
       </w:r>
-      <w:bookmarkEnd w:id="7"/>
+      <w:bookmarkEnd w:id="8"/>
     </w:p>
     <w:tbl>
       <w:tblPr>
@@ -3112,12 +3037,6 @@
         <w:gridCol w:w="5138"/>
       </w:tblGrid>
       <w:tr>
-        <w:tblPrEx>
-          <w:tblCellMar>
-            <w:top w:w="0" w:type="dxa"/>
-            <w:bottom w:w="0" w:type="dxa"/>
-          </w:tblCellMar>
-        </w:tblPrEx>
         <w:trPr>
           <w:tblHeader/>
         </w:trPr>
@@ -3229,12 +3148,6 @@
         </w:tc>
       </w:tr>
       <w:tr>
-        <w:tblPrEx>
-          <w:tblCellMar>
-            <w:top w:w="0" w:type="dxa"/>
-            <w:bottom w:w="0" w:type="dxa"/>
-          </w:tblCellMar>
-        </w:tblPrEx>
         <w:trPr>
           <w:cantSplit/>
         </w:trPr>
@@ -3326,12 +3239,6 @@
         </w:tc>
       </w:tr>
       <w:tr>
-        <w:tblPrEx>
-          <w:tblCellMar>
-            <w:top w:w="0" w:type="dxa"/>
-            <w:bottom w:w="0" w:type="dxa"/>
-          </w:tblCellMar>
-        </w:tblPrEx>
         <w:trPr>
           <w:cantSplit/>
         </w:trPr>
@@ -3418,12 +3325,6 @@
         </w:tc>
       </w:tr>
       <w:tr>
-        <w:tblPrEx>
-          <w:tblCellMar>
-            <w:top w:w="0" w:type="dxa"/>
-            <w:bottom w:w="0" w:type="dxa"/>
-          </w:tblCellMar>
-        </w:tblPrEx>
         <w:trPr>
           <w:cantSplit/>
         </w:trPr>
@@ -3507,12 +3408,6 @@
         </w:tc>
       </w:tr>
       <w:tr>
-        <w:tblPrEx>
-          <w:tblCellMar>
-            <w:top w:w="0" w:type="dxa"/>
-            <w:bottom w:w="0" w:type="dxa"/>
-          </w:tblCellMar>
-        </w:tblPrEx>
         <w:trPr>
           <w:cantSplit/>
         </w:trPr>
@@ -3608,11 +3503,11 @@
       <w:pPr>
         <w:pStyle w:val="Heading2"/>
       </w:pPr>
-      <w:bookmarkStart w:id="8" w:name="_Toc241911189"/>
+      <w:bookmarkStart w:id="9" w:name="_Toc241911189"/>
       <w:r>
         <w:t>1.8 Open Source Justification</w:t>
       </w:r>
-      <w:bookmarkEnd w:id="8"/>
+      <w:bookmarkEnd w:id="9"/>
     </w:p>
     <w:p>
       <w:pPr>
@@ -3703,11 +3598,11 @@
       <w:pPr>
         <w:pStyle w:val="Heading2"/>
       </w:pPr>
-      <w:bookmarkStart w:id="9" w:name="_Toc241911190"/>
+      <w:bookmarkStart w:id="10" w:name="_Toc241911190"/>
       <w:r>
         <w:t>1.9 Digital Public Goods Justification</w:t>
       </w:r>
-      <w:bookmarkEnd w:id="9"/>
+      <w:bookmarkEnd w:id="10"/>
     </w:p>
     <w:p>
       <w:pPr>
@@ -3831,12 +3726,12 @@
         <w:pStyle w:val="Heading1"/>
         <w:pageBreakBefore/>
       </w:pPr>
-      <w:bookmarkStart w:id="10" w:name="_Toc241911191"/>
+      <w:bookmarkStart w:id="11" w:name="_Toc241911191"/>
       <w:r>
         <w:lastRenderedPageBreak/>
         <w:t>2. ALGORITHM</w:t>
       </w:r>
-      <w:bookmarkEnd w:id="10"/>
+      <w:bookmarkEnd w:id="11"/>
     </w:p>
     <w:p>
       <w:pPr>
@@ -3858,11 +3753,11 @@
       <w:pPr>
         <w:pStyle w:val="Heading2"/>
       </w:pPr>
-      <w:bookmarkStart w:id="11" w:name="_Toc241911192"/>
+      <w:bookmarkStart w:id="12" w:name="_Toc241911192"/>
       <w:r>
         <w:t>2.1 Input, Processing and Output</w:t>
       </w:r>
-      <w:bookmarkEnd w:id="11"/>
+      <w:bookmarkEnd w:id="12"/>
     </w:p>
     <w:tbl>
       <w:tblPr>
@@ -3887,12 +3782,6 @@
         <w:gridCol w:w="7838"/>
       </w:tblGrid>
       <w:tr>
-        <w:tblPrEx>
-          <w:tblCellMar>
-            <w:top w:w="0" w:type="dxa"/>
-            <w:bottom w:w="0" w:type="dxa"/>
-          </w:tblCellMar>
-        </w:tblPrEx>
         <w:trPr>
           <w:tblHeader/>
         </w:trPr>
@@ -3962,12 +3851,6 @@
         </w:tc>
       </w:tr>
       <w:tr>
-        <w:tblPrEx>
-          <w:tblCellMar>
-            <w:top w:w="0" w:type="dxa"/>
-            <w:bottom w:w="0" w:type="dxa"/>
-          </w:tblCellMar>
-        </w:tblPrEx>
         <w:trPr>
           <w:cantSplit/>
         </w:trPr>
@@ -4072,12 +3955,6 @@
         </w:tc>
       </w:tr>
       <w:tr>
-        <w:tblPrEx>
-          <w:tblCellMar>
-            <w:top w:w="0" w:type="dxa"/>
-            <w:bottom w:w="0" w:type="dxa"/>
-          </w:tblCellMar>
-        </w:tblPrEx>
         <w:trPr>
           <w:cantSplit/>
         </w:trPr>
@@ -4137,12 +4014,6 @@
         </w:tc>
       </w:tr>
       <w:tr>
-        <w:tblPrEx>
-          <w:tblCellMar>
-            <w:top w:w="0" w:type="dxa"/>
-            <w:bottom w:w="0" w:type="dxa"/>
-          </w:tblCellMar>
-        </w:tblPrEx>
         <w:trPr>
           <w:cantSplit/>
         </w:trPr>
@@ -4209,11 +4080,11 @@
       <w:pPr>
         <w:pStyle w:val="Heading2"/>
       </w:pPr>
-      <w:bookmarkStart w:id="12" w:name="_Toc241911193"/>
+      <w:bookmarkStart w:id="13" w:name="_Toc241911193"/>
       <w:r>
         <w:t>2.2 Step-by-Step Algorithm</w:t>
       </w:r>
-      <w:bookmarkEnd w:id="12"/>
+      <w:bookmarkEnd w:id="13"/>
     </w:p>
     <w:p>
       <w:pPr>
@@ -4391,8 +4262,6 @@
       <w:r>
         <w:t>, go to Step 15.</w:t>
       </w:r>
-      <w:bookmarkStart w:id="13" w:name="_GoBack"/>
-      <w:bookmarkEnd w:id="13"/>
     </w:p>
     <w:p>
       <w:pPr>
@@ -4724,12 +4593,6 @@
         <w:gridCol w:w="5438"/>
       </w:tblGrid>
       <w:tr>
-        <w:tblPrEx>
-          <w:tblCellMar>
-            <w:top w:w="0" w:type="dxa"/>
-            <w:bottom w:w="0" w:type="dxa"/>
-          </w:tblCellMar>
-        </w:tblPrEx>
         <w:trPr>
           <w:tblHeader/>
         </w:trPr>
@@ -4831,12 +4694,6 @@
         </w:tc>
       </w:tr>
       <w:tr>
-        <w:tblPrEx>
-          <w:tblCellMar>
-            <w:top w:w="0" w:type="dxa"/>
-            <w:bottom w:w="0" w:type="dxa"/>
-          </w:tblCellMar>
-        </w:tblPrEx>
         <w:trPr>
           <w:cantSplit/>
         </w:trPr>
@@ -4920,12 +4777,6 @@
         </w:tc>
       </w:tr>
       <w:tr>
-        <w:tblPrEx>
-          <w:tblCellMar>
-            <w:top w:w="0" w:type="dxa"/>
-            <w:bottom w:w="0" w:type="dxa"/>
-          </w:tblCellMar>
-        </w:tblPrEx>
         <w:trPr>
           <w:cantSplit/>
         </w:trPr>
@@ -5012,12 +4863,6 @@
         </w:tc>
       </w:tr>
       <w:tr>
-        <w:tblPrEx>
-          <w:tblCellMar>
-            <w:top w:w="0" w:type="dxa"/>
-            <w:bottom w:w="0" w:type="dxa"/>
-          </w:tblCellMar>
-        </w:tblPrEx>
         <w:trPr>
           <w:cantSplit/>
         </w:trPr>
@@ -5101,12 +4946,6 @@
         </w:tc>
       </w:tr>
       <w:tr>
-        <w:tblPrEx>
-          <w:tblCellMar>
-            <w:top w:w="0" w:type="dxa"/>
-            <w:bottom w:w="0" w:type="dxa"/>
-          </w:tblCellMar>
-        </w:tblPrEx>
         <w:trPr>
           <w:cantSplit/>
         </w:trPr>
@@ -5193,12 +5032,6 @@
         </w:tc>
       </w:tr>
       <w:tr>
-        <w:tblPrEx>
-          <w:tblCellMar>
-            <w:top w:w="0" w:type="dxa"/>
-            <w:bottom w:w="0" w:type="dxa"/>
-          </w:tblCellMar>
-        </w:tblPrEx>
         <w:trPr>
           <w:cantSplit/>
         </w:trPr>
@@ -5282,12 +5115,6 @@
         </w:tc>
       </w:tr>
       <w:tr>
-        <w:tblPrEx>
-          <w:tblCellMar>
-            <w:top w:w="0" w:type="dxa"/>
-            <w:bottom w:w="0" w:type="dxa"/>
-          </w:tblCellMar>
-        </w:tblPrEx>
         <w:trPr>
           <w:cantSplit/>
         </w:trPr>
@@ -5376,12 +5203,6 @@
         </w:tc>
       </w:tr>
       <w:tr>
-        <w:tblPrEx>
-          <w:tblCellMar>
-            <w:top w:w="0" w:type="dxa"/>
-            <w:bottom w:w="0" w:type="dxa"/>
-          </w:tblCellMar>
-        </w:tblPrEx>
         <w:trPr>
           <w:cantSplit/>
         </w:trPr>
@@ -5475,12 +5296,6 @@
         </w:tc>
       </w:tr>
       <w:tr>
-        <w:tblPrEx>
-          <w:tblCellMar>
-            <w:top w:w="0" w:type="dxa"/>
-            <w:bottom w:w="0" w:type="dxa"/>
-          </w:tblCellMar>
-        </w:tblPrEx>
         <w:trPr>
           <w:cantSplit/>
         </w:trPr>
@@ -5582,12 +5397,6 @@
         </w:tc>
       </w:tr>
       <w:tr>
-        <w:tblPrEx>
-          <w:tblCellMar>
-            <w:top w:w="0" w:type="dxa"/>
-            <w:bottom w:w="0" w:type="dxa"/>
-          </w:tblCellMar>
-        </w:tblPrEx>
         <w:trPr>
           <w:cantSplit/>
         </w:trPr>
@@ -5681,12 +5490,6 @@
         </w:tc>
       </w:tr>
       <w:tr>
-        <w:tblPrEx>
-          <w:tblCellMar>
-            <w:top w:w="0" w:type="dxa"/>
-            <w:bottom w:w="0" w:type="dxa"/>
-          </w:tblCellMar>
-        </w:tblPrEx>
         <w:trPr>
           <w:cantSplit/>
         </w:trPr>
@@ -5773,12 +5576,6 @@
         </w:tc>
       </w:tr>
       <w:tr>
-        <w:tblPrEx>
-          <w:tblCellMar>
-            <w:top w:w="0" w:type="dxa"/>
-            <w:bottom w:w="0" w:type="dxa"/>
-          </w:tblCellMar>
-        </w:tblPrEx>
         <w:trPr>
           <w:cantSplit/>
         </w:trPr>
@@ -5930,12 +5727,6 @@
         <w:gridCol w:w="9638"/>
       </w:tblGrid>
       <w:tr>
-        <w:tblPrEx>
-          <w:tblCellMar>
-            <w:top w:w="0" w:type="dxa"/>
-            <w:bottom w:w="0" w:type="dxa"/>
-          </w:tblCellMar>
-        </w:tblPrEx>
         <w:tc>
           <w:tcPr>
             <w:tcW w:w="9638" w:type="dxa"/>
@@ -7010,12 +6801,6 @@
         <w:gridCol w:w="9638"/>
       </w:tblGrid>
       <w:tr>
-        <w:tblPrEx>
-          <w:tblCellMar>
-            <w:top w:w="0" w:type="dxa"/>
-            <w:bottom w:w="0" w:type="dxa"/>
-          </w:tblCellMar>
-        </w:tblPrEx>
         <w:tc>
           <w:tcPr>
             <w:tcW w:w="9638" w:type="dxa"/>
@@ -8167,26 +7952,15 @@
         <w:spacing w:after="120"/>
       </w:pPr>
       <w:r>
-        <w:t xml:space="preserve">Flowcharts were drawn using standard symbols: rounded rectangles for START/END, parallelograms for input/output, rectangles for processes, and diamonds for decisions. Figure 1 shows the main program and Figure 2 shows the </w:t>
-      </w:r>
-      <w:proofErr w:type="spellStart"/>
-      <w:proofErr w:type="gramStart"/>
-      <w:r>
-        <w:t>classifyPriority</w:t>
-      </w:r>
-      <w:proofErr w:type="spellEnd"/>
-      <w:r>
-        <w:t>(</w:t>
-      </w:r>
-      <w:proofErr w:type="gramEnd"/>
-      <w:r>
-        <w:t>) function.</w:t>
+        <w:t>Flowcharts were drawn using standard symbols: rounded rectangles for START/END, parallelograms for input/output, rectangles for processes, and diamonds fo</w:t>
+      </w:r>
+      <w:r>
+        <w:t xml:space="preserve">r decisions. </w:t>
       </w:r>
     </w:p>
     <w:p>
       <w:pPr>
-        <w:spacing w:after="80" w:line="240" w:lineRule="auto"/>
-        <w:jc w:val="center"/>
+        <w:spacing w:after="120"/>
       </w:pPr>
       <w:r>
         <w:rPr>
@@ -8194,9 +7968,9 @@
         </w:rPr>
         <w:drawing>
           <wp:inline distT="0" distB="0" distL="0" distR="0">
-            <wp:extent cx="4000500" cy="6896100"/>
-            <wp:effectExtent l="0" t="0" r="0" b="0"/>
-            <wp:docPr id="1" name="/home/claude/work/flow_main.png" descr="Flowchart" title="/home/claude/work/flow_main.png"/>
+            <wp:extent cx="6096000" cy="8128000"/>
+            <wp:effectExtent l="0" t="0" r="0" b="6350"/>
+            <wp:docPr id="8" name="Picture 8"/>
             <wp:cNvGraphicFramePr>
               <a:graphicFrameLocks xmlns:a="http://schemas.openxmlformats.org/drawingml/2006/main" noChangeAspect="1"/>
             </wp:cNvGraphicFramePr>
@@ -8204,22 +7978,25 @@
               <a:graphicData uri="http://schemas.openxmlformats.org/drawingml/2006/picture">
                 <pic:pic xmlns:pic="http://schemas.openxmlformats.org/drawingml/2006/picture">
                   <pic:nvPicPr>
-                    <pic:cNvPr id="0" name=""/>
-                    <pic:cNvPicPr>
-                      <a:picLocks noChangeAspect="1" noChangeArrowheads="1"/>
-                    </pic:cNvPicPr>
+                    <pic:cNvPr id="0" name="chart1.jpeg"/>
+                    <pic:cNvPicPr/>
                   </pic:nvPicPr>
                   <pic:blipFill>
-                    <a:blip r:embed="rId8"/>
-                    <a:srcRect/>
+                    <a:blip r:embed="rId8">
+                      <a:extLst>
+                        <a:ext uri="{28A0092B-C50C-407E-A947-70E740481C1C}">
+                          <a14:useLocalDpi xmlns:a14="http://schemas.microsoft.com/office/drawing/2010/main" val="0"/>
+                        </a:ext>
+                      </a:extLst>
+                    </a:blip>
                     <a:stretch>
                       <a:fillRect/>
                     </a:stretch>
                   </pic:blipFill>
-                  <pic:spPr bwMode="auto">
+                  <pic:spPr>
                     <a:xfrm>
                       <a:off x="0" y="0"/>
-                      <a:ext cx="4000500" cy="6896100"/>
+                      <a:ext cx="6096000" cy="8128000"/>
                     </a:xfrm>
                     <a:prstGeom prst="rect">
                       <a:avLst/>
@@ -8234,37 +8011,6 @@
     </w:p>
     <w:p>
       <w:pPr>
-        <w:spacing w:after="160"/>
-        <w:jc w:val="center"/>
-      </w:pPr>
-      <w:r>
-        <w:rPr>
-          <w:i/>
-          <w:iCs/>
-          <w:sz w:val="18"/>
-          <w:szCs w:val="18"/>
-        </w:rPr>
-        <w:t xml:space="preserve">Figure 1: Main program flowchart – </w:t>
-      </w:r>
-      <w:proofErr w:type="spellStart"/>
-      <w:r>
-        <w:rPr>
-          <w:i/>
-          <w:iCs/>
-          <w:sz w:val="18"/>
-          <w:szCs w:val="18"/>
-        </w:rPr>
-        <w:t>CleanFreetown</w:t>
-      </w:r>
-      <w:proofErr w:type="spellEnd"/>
-    </w:p>
-    <w:p>
-      <w:r>
-        <w:br w:type="page"/>
-      </w:r>
-    </w:p>
-    <w:p>
-      <w:pPr>
         <w:spacing w:after="80" w:line="240" w:lineRule="auto"/>
         <w:jc w:val="center"/>
       </w:pPr>
@@ -8275,9 +8021,9 @@
         <w:lastRenderedPageBreak/>
         <w:drawing>
           <wp:inline distT="0" distB="0" distL="0" distR="0">
-            <wp:extent cx="4953000" cy="7086600"/>
-            <wp:effectExtent l="0" t="0" r="0" b="0"/>
-            <wp:docPr id="2" name="/home/claude/work/flow_classify.png" descr="Flowchart" title="/home/claude/work/flow_classify.png"/>
+            <wp:extent cx="6096000" cy="8128000"/>
+            <wp:effectExtent l="0" t="0" r="0" b="6350"/>
+            <wp:docPr id="7" name="Picture 7"/>
             <wp:cNvGraphicFramePr>
               <a:graphicFrameLocks xmlns:a="http://schemas.openxmlformats.org/drawingml/2006/main" noChangeAspect="1"/>
             </wp:cNvGraphicFramePr>
@@ -8285,22 +8031,25 @@
               <a:graphicData uri="http://schemas.openxmlformats.org/drawingml/2006/picture">
                 <pic:pic xmlns:pic="http://schemas.openxmlformats.org/drawingml/2006/picture">
                   <pic:nvPicPr>
-                    <pic:cNvPr id="0" name=""/>
-                    <pic:cNvPicPr>
-                      <a:picLocks noChangeAspect="1" noChangeArrowheads="1"/>
-                    </pic:cNvPicPr>
+                    <pic:cNvPr id="0" name="chart2.jpeg"/>
+                    <pic:cNvPicPr/>
                   </pic:nvPicPr>
                   <pic:blipFill>
-                    <a:blip r:embed="rId9"/>
-                    <a:srcRect/>
+                    <a:blip r:embed="rId9">
+                      <a:extLst>
+                        <a:ext uri="{28A0092B-C50C-407E-A947-70E740481C1C}">
+                          <a14:useLocalDpi xmlns:a14="http://schemas.microsoft.com/office/drawing/2010/main" val="0"/>
+                        </a:ext>
+                      </a:extLst>
+                    </a:blip>
                     <a:stretch>
                       <a:fillRect/>
                     </a:stretch>
                   </pic:blipFill>
-                  <pic:spPr bwMode="auto">
+                  <pic:spPr>
                     <a:xfrm>
                       <a:off x="0" y="0"/>
-                      <a:ext cx="4953000" cy="7086600"/>
+                      <a:ext cx="6096000" cy="8128000"/>
                     </a:xfrm>
                     <a:prstGeom prst="rect">
                       <a:avLst/>
@@ -8316,8 +8065,287 @@
     <w:p>
       <w:pPr>
         <w:spacing w:after="160"/>
+      </w:pPr>
+      <w:r>
+        <w:t xml:space="preserve">        Fig1. Flowchart for </w:t>
+      </w:r>
+      <w:proofErr w:type="spellStart"/>
+      <w:r>
+        <w:t>classifypriority</w:t>
+      </w:r>
+      <w:proofErr w:type="spellEnd"/>
+    </w:p>
+    <w:p>
+      <w:pPr>
+        <w:rPr>
+          <w:noProof/>
+        </w:rPr>
+      </w:pPr>
+      <w:r>
+        <w:br w:type="page"/>
+      </w:r>
+    </w:p>
+    <w:p>
+      <w:r>
+        <w:rPr>
+          <w:noProof/>
+        </w:rPr>
+        <w:lastRenderedPageBreak/>
+        <w:drawing>
+          <wp:inline distT="0" distB="0" distL="0" distR="0">
+            <wp:extent cx="6094071" cy="5040775"/>
+            <wp:effectExtent l="0" t="0" r="2540" b="7620"/>
+            <wp:docPr id="21" name="Picture 21"/>
+            <wp:cNvGraphicFramePr>
+              <a:graphicFrameLocks xmlns:a="http://schemas.openxmlformats.org/drawingml/2006/main" noChangeAspect="1"/>
+            </wp:cNvGraphicFramePr>
+            <a:graphic xmlns:a="http://schemas.openxmlformats.org/drawingml/2006/main">
+              <a:graphicData uri="http://schemas.openxmlformats.org/drawingml/2006/picture">
+                <pic:pic xmlns:pic="http://schemas.openxmlformats.org/drawingml/2006/picture">
+                  <pic:nvPicPr>
+                    <pic:cNvPr id="0" name="1.jpeg"/>
+                    <pic:cNvPicPr/>
+                  </pic:nvPicPr>
+                  <pic:blipFill>
+                    <a:blip r:embed="rId10">
+                      <a:extLst>
+                        <a:ext uri="{28A0092B-C50C-407E-A947-70E740481C1C}">
+                          <a14:useLocalDpi xmlns:a14="http://schemas.microsoft.com/office/drawing/2010/main" val="0"/>
+                        </a:ext>
+                      </a:extLst>
+                    </a:blip>
+                    <a:stretch>
+                      <a:fillRect/>
+                    </a:stretch>
+                  </pic:blipFill>
+                  <pic:spPr>
+                    <a:xfrm>
+                      <a:off x="0" y="0"/>
+                      <a:ext cx="6096000" cy="5042371"/>
+                    </a:xfrm>
+                    <a:prstGeom prst="rect">
+                      <a:avLst/>
+                    </a:prstGeom>
+                  </pic:spPr>
+                </pic:pic>
+              </a:graphicData>
+            </a:graphic>
+          </wp:inline>
+        </w:drawing>
+      </w:r>
+    </w:p>
+    <w:p>
+      <w:pPr>
+        <w:rPr>
+          <w:noProof/>
+        </w:rPr>
+      </w:pPr>
+      <w:r>
+        <w:rPr>
+          <w:noProof/>
+        </w:rPr>
+        <w:lastRenderedPageBreak/>
+        <w:drawing>
+          <wp:inline distT="0" distB="0" distL="0" distR="0">
+            <wp:extent cx="6120130" cy="4590415"/>
+            <wp:effectExtent l="0" t="0" r="0" b="635"/>
+            <wp:docPr id="26" name="Picture 26"/>
+            <wp:cNvGraphicFramePr>
+              <a:graphicFrameLocks xmlns:a="http://schemas.openxmlformats.org/drawingml/2006/main" noChangeAspect="1"/>
+            </wp:cNvGraphicFramePr>
+            <a:graphic xmlns:a="http://schemas.openxmlformats.org/drawingml/2006/main">
+              <a:graphicData uri="http://schemas.openxmlformats.org/drawingml/2006/picture">
+                <pic:pic xmlns:pic="http://schemas.openxmlformats.org/drawingml/2006/picture">
+                  <pic:nvPicPr>
+                    <pic:cNvPr id="0" name="2.jpeg"/>
+                    <pic:cNvPicPr/>
+                  </pic:nvPicPr>
+                  <pic:blipFill>
+                    <a:blip r:embed="rId11">
+                      <a:extLst>
+                        <a:ext uri="{28A0092B-C50C-407E-A947-70E740481C1C}">
+                          <a14:useLocalDpi xmlns:a14="http://schemas.microsoft.com/office/drawing/2010/main" val="0"/>
+                        </a:ext>
+                      </a:extLst>
+                    </a:blip>
+                    <a:stretch>
+                      <a:fillRect/>
+                    </a:stretch>
+                  </pic:blipFill>
+                  <pic:spPr>
+                    <a:xfrm>
+                      <a:off x="0" y="0"/>
+                      <a:ext cx="6120130" cy="4590415"/>
+                    </a:xfrm>
+                    <a:prstGeom prst="rect">
+                      <a:avLst/>
+                    </a:prstGeom>
+                  </pic:spPr>
+                </pic:pic>
+              </a:graphicData>
+            </a:graphic>
+          </wp:inline>
+        </w:drawing>
+      </w:r>
+    </w:p>
+    <w:p>
+      <w:r>
+        <w:rPr>
+          <w:noProof/>
+        </w:rPr>
+        <w:lastRenderedPageBreak/>
+        <w:drawing>
+          <wp:inline distT="0" distB="0" distL="0" distR="0">
+            <wp:extent cx="6120130" cy="4590415"/>
+            <wp:effectExtent l="0" t="0" r="0" b="635"/>
+            <wp:docPr id="27" name="Picture 27"/>
+            <wp:cNvGraphicFramePr>
+              <a:graphicFrameLocks xmlns:a="http://schemas.openxmlformats.org/drawingml/2006/main" noChangeAspect="1"/>
+            </wp:cNvGraphicFramePr>
+            <a:graphic xmlns:a="http://schemas.openxmlformats.org/drawingml/2006/main">
+              <a:graphicData uri="http://schemas.openxmlformats.org/drawingml/2006/picture">
+                <pic:pic xmlns:pic="http://schemas.openxmlformats.org/drawingml/2006/picture">
+                  <pic:nvPicPr>
+                    <pic:cNvPr id="0" name="4.jpeg"/>
+                    <pic:cNvPicPr/>
+                  </pic:nvPicPr>
+                  <pic:blipFill>
+                    <a:blip r:embed="rId12">
+                      <a:extLst>
+                        <a:ext uri="{28A0092B-C50C-407E-A947-70E740481C1C}">
+                          <a14:useLocalDpi xmlns:a14="http://schemas.microsoft.com/office/drawing/2010/main" val="0"/>
+                        </a:ext>
+                      </a:extLst>
+                    </a:blip>
+                    <a:stretch>
+                      <a:fillRect/>
+                    </a:stretch>
+                  </pic:blipFill>
+                  <pic:spPr>
+                    <a:xfrm>
+                      <a:off x="0" y="0"/>
+                      <a:ext cx="6120130" cy="4590415"/>
+                    </a:xfrm>
+                    <a:prstGeom prst="rect">
+                      <a:avLst/>
+                    </a:prstGeom>
+                  </pic:spPr>
+                </pic:pic>
+              </a:graphicData>
+            </a:graphic>
+          </wp:inline>
+        </w:drawing>
+      </w:r>
+    </w:p>
+    <w:p>
+      <w:pPr>
+        <w:rPr>
+          <w:noProof/>
+        </w:rPr>
+      </w:pPr>
+      <w:r>
+        <w:rPr>
+          <w:noProof/>
+        </w:rPr>
+        <w:drawing>
+          <wp:inline distT="0" distB="0" distL="0" distR="0">
+            <wp:extent cx="6117221" cy="2296723"/>
+            <wp:effectExtent l="0" t="0" r="0" b="8890"/>
+            <wp:docPr id="20" name="Picture 20"/>
+            <wp:cNvGraphicFramePr>
+              <a:graphicFrameLocks xmlns:a="http://schemas.openxmlformats.org/drawingml/2006/main" noChangeAspect="1"/>
+            </wp:cNvGraphicFramePr>
+            <a:graphic xmlns:a="http://schemas.openxmlformats.org/drawingml/2006/main">
+              <a:graphicData uri="http://schemas.openxmlformats.org/drawingml/2006/picture">
+                <pic:pic xmlns:pic="http://schemas.openxmlformats.org/drawingml/2006/picture">
+                  <pic:nvPicPr>
+                    <pic:cNvPr id="0" name="5.jpeg"/>
+                    <pic:cNvPicPr/>
+                  </pic:nvPicPr>
+                  <pic:blipFill>
+                    <a:blip r:embed="rId13">
+                      <a:extLst>
+                        <a:ext uri="{28A0092B-C50C-407E-A947-70E740481C1C}">
+                          <a14:useLocalDpi xmlns:a14="http://schemas.microsoft.com/office/drawing/2010/main" val="0"/>
+                        </a:ext>
+                      </a:extLst>
+                    </a:blip>
+                    <a:stretch>
+                      <a:fillRect/>
+                    </a:stretch>
+                  </pic:blipFill>
+                  <pic:spPr>
+                    <a:xfrm>
+                      <a:off x="0" y="0"/>
+                      <a:ext cx="6120130" cy="2297815"/>
+                    </a:xfrm>
+                    <a:prstGeom prst="rect">
+                      <a:avLst/>
+                    </a:prstGeom>
+                  </pic:spPr>
+                </pic:pic>
+              </a:graphicData>
+            </a:graphic>
+          </wp:inline>
+        </w:drawing>
+      </w:r>
+    </w:p>
+    <w:p>
+      <w:pPr>
+        <w:spacing w:after="160"/>
         <w:jc w:val="center"/>
       </w:pPr>
+      <w:r>
+        <w:rPr>
+          <w:i/>
+          <w:iCs/>
+          <w:noProof/>
+          <w:sz w:val="18"/>
+          <w:szCs w:val="18"/>
+        </w:rPr>
+        <w:lastRenderedPageBreak/>
+        <w:drawing>
+          <wp:inline distT="0" distB="0" distL="0" distR="0">
+            <wp:extent cx="6117220" cy="2934182"/>
+            <wp:effectExtent l="0" t="0" r="0" b="0"/>
+            <wp:docPr id="15" name="Picture 15"/>
+            <wp:cNvGraphicFramePr>
+              <a:graphicFrameLocks xmlns:a="http://schemas.openxmlformats.org/drawingml/2006/main" noChangeAspect="1"/>
+            </wp:cNvGraphicFramePr>
+            <a:graphic xmlns:a="http://schemas.openxmlformats.org/drawingml/2006/main">
+              <a:graphicData uri="http://schemas.openxmlformats.org/drawingml/2006/picture">
+                <pic:pic xmlns:pic="http://schemas.openxmlformats.org/drawingml/2006/picture">
+                  <pic:nvPicPr>
+                    <pic:cNvPr id="0" name="6.jpeg"/>
+                    <pic:cNvPicPr/>
+                  </pic:nvPicPr>
+                  <pic:blipFill>
+                    <a:blip r:embed="rId14">
+                      <a:extLst>
+                        <a:ext uri="{28A0092B-C50C-407E-A947-70E740481C1C}">
+                          <a14:useLocalDpi xmlns:a14="http://schemas.microsoft.com/office/drawing/2010/main" val="0"/>
+                        </a:ext>
+                      </a:extLst>
+                    </a:blip>
+                    <a:stretch>
+                      <a:fillRect/>
+                    </a:stretch>
+                  </pic:blipFill>
+                  <pic:spPr>
+                    <a:xfrm>
+                      <a:off x="0" y="0"/>
+                      <a:ext cx="6120130" cy="2935578"/>
+                    </a:xfrm>
+                    <a:prstGeom prst="rect">
+                      <a:avLst/>
+                    </a:prstGeom>
+                  </pic:spPr>
+                </pic:pic>
+              </a:graphicData>
+            </a:graphic>
+          </wp:inline>
+        </w:drawing>
+      </w:r>
       <w:r>
         <w:rPr>
           <w:i/>
@@ -8325,10 +8353,8 @@
           <w:sz w:val="18"/>
           <w:szCs w:val="18"/>
         </w:rPr>
-        <w:t xml:space="preserve">Figure 2: Flowchart for the </w:t>
-      </w:r>
-      <w:proofErr w:type="spellStart"/>
-      <w:proofErr w:type="gramStart"/>
+        <w:t xml:space="preserve">Figure </w:t>
+      </w:r>
       <w:r>
         <w:rPr>
           <w:i/>
@@ -8336,9 +8362,9 @@
           <w:sz w:val="18"/>
           <w:szCs w:val="18"/>
         </w:rPr>
-        <w:t>classifyPriority</w:t>
-      </w:r>
-      <w:proofErr w:type="spellEnd"/>
+        <w:t xml:space="preserve">2: Flowchart for </w:t>
+      </w:r>
+      <w:proofErr w:type="spellStart"/>
       <w:r>
         <w:rPr>
           <w:i/>
@@ -8346,18 +8372,9 @@
           <w:sz w:val="18"/>
           <w:szCs w:val="18"/>
         </w:rPr>
-        <w:t>(</w:t>
-      </w:r>
-      <w:proofErr w:type="gramEnd"/>
-      <w:r>
-        <w:rPr>
-          <w:i/>
-          <w:iCs/>
-          <w:sz w:val="18"/>
-          <w:szCs w:val="18"/>
-        </w:rPr>
-        <w:t>) function</w:t>
-      </w:r>
+        <w:t>mainchart</w:t>
+      </w:r>
+      <w:proofErr w:type="spellEnd"/>
     </w:p>
     <w:p>
       <w:pPr>
@@ -8404,12 +8421,6 @@
         <w:gridCol w:w="4338"/>
       </w:tblGrid>
       <w:tr>
-        <w:tblPrEx>
-          <w:tblCellMar>
-            <w:top w:w="0" w:type="dxa"/>
-            <w:bottom w:w="0" w:type="dxa"/>
-          </w:tblCellMar>
-        </w:tblPrEx>
         <w:trPr>
           <w:tblHeader/>
         </w:trPr>
@@ -8543,12 +8554,6 @@
         </w:tc>
       </w:tr>
       <w:tr>
-        <w:tblPrEx>
-          <w:tblCellMar>
-            <w:top w:w="0" w:type="dxa"/>
-            <w:bottom w:w="0" w:type="dxa"/>
-          </w:tblCellMar>
-        </w:tblPrEx>
         <w:trPr>
           <w:cantSplit/>
         </w:trPr>
@@ -8671,12 +8676,6 @@
         </w:tc>
       </w:tr>
       <w:tr>
-        <w:tblPrEx>
-          <w:tblCellMar>
-            <w:top w:w="0" w:type="dxa"/>
-            <w:bottom w:w="0" w:type="dxa"/>
-          </w:tblCellMar>
-        </w:tblPrEx>
         <w:trPr>
           <w:cantSplit/>
         </w:trPr>
@@ -8803,12 +8802,6 @@
         </w:tc>
       </w:tr>
       <w:tr>
-        <w:tblPrEx>
-          <w:tblCellMar>
-            <w:top w:w="0" w:type="dxa"/>
-            <w:bottom w:w="0" w:type="dxa"/>
-          </w:tblCellMar>
-        </w:tblPrEx>
         <w:trPr>
           <w:cantSplit/>
         </w:trPr>
@@ -8923,12 +8916,6 @@
         </w:tc>
       </w:tr>
       <w:tr>
-        <w:tblPrEx>
-          <w:tblCellMar>
-            <w:top w:w="0" w:type="dxa"/>
-            <w:bottom w:w="0" w:type="dxa"/>
-          </w:tblCellMar>
-        </w:tblPrEx>
         <w:trPr>
           <w:cantSplit/>
         </w:trPr>
@@ -9042,12 +9029,6 @@
         </w:tc>
       </w:tr>
       <w:tr>
-        <w:tblPrEx>
-          <w:tblCellMar>
-            <w:top w:w="0" w:type="dxa"/>
-            <w:bottom w:w="0" w:type="dxa"/>
-          </w:tblCellMar>
-        </w:tblPrEx>
         <w:trPr>
           <w:cantSplit/>
         </w:trPr>
@@ -9162,12 +9143,6 @@
         </w:tc>
       </w:tr>
       <w:tr>
-        <w:tblPrEx>
-          <w:tblCellMar>
-            <w:top w:w="0" w:type="dxa"/>
-            <w:bottom w:w="0" w:type="dxa"/>
-          </w:tblCellMar>
-        </w:tblPrEx>
         <w:trPr>
           <w:cantSplit/>
         </w:trPr>
@@ -9324,12 +9299,6 @@
         <w:gridCol w:w="6938"/>
       </w:tblGrid>
       <w:tr>
-        <w:tblPrEx>
-          <w:tblCellMar>
-            <w:top w:w="0" w:type="dxa"/>
-            <w:bottom w:w="0" w:type="dxa"/>
-          </w:tblCellMar>
-        </w:tblPrEx>
         <w:trPr>
           <w:tblHeader/>
         </w:trPr>
@@ -9399,12 +9368,6 @@
         </w:tc>
       </w:tr>
       <w:tr>
-        <w:tblPrEx>
-          <w:tblCellMar>
-            <w:top w:w="0" w:type="dxa"/>
-            <w:bottom w:w="0" w:type="dxa"/>
-          </w:tblCellMar>
-        </w:tblPrEx>
         <w:trPr>
           <w:cantSplit/>
         </w:trPr>
@@ -9462,12 +9425,6 @@
         </w:tc>
       </w:tr>
       <w:tr>
-        <w:tblPrEx>
-          <w:tblCellMar>
-            <w:top w:w="0" w:type="dxa"/>
-            <w:bottom w:w="0" w:type="dxa"/>
-          </w:tblCellMar>
-        </w:tblPrEx>
         <w:trPr>
           <w:cantSplit/>
         </w:trPr>
@@ -9527,12 +9484,6 @@
         </w:tc>
       </w:tr>
       <w:tr>
-        <w:tblPrEx>
-          <w:tblCellMar>
-            <w:top w:w="0" w:type="dxa"/>
-            <w:bottom w:w="0" w:type="dxa"/>
-          </w:tblCellMar>
-        </w:tblPrEx>
         <w:trPr>
           <w:cantSplit/>
         </w:trPr>
@@ -9611,12 +9562,6 @@
         </w:tc>
       </w:tr>
       <w:tr>
-        <w:tblPrEx>
-          <w:tblCellMar>
-            <w:top w:w="0" w:type="dxa"/>
-            <w:bottom w:w="0" w:type="dxa"/>
-          </w:tblCellMar>
-        </w:tblPrEx>
         <w:trPr>
           <w:cantSplit/>
         </w:trPr>
@@ -9676,12 +9621,6 @@
         </w:tc>
       </w:tr>
       <w:tr>
-        <w:tblPrEx>
-          <w:tblCellMar>
-            <w:top w:w="0" w:type="dxa"/>
-            <w:bottom w:w="0" w:type="dxa"/>
-          </w:tblCellMar>
-        </w:tblPrEx>
         <w:trPr>
           <w:cantSplit/>
         </w:trPr>
@@ -9739,12 +9678,6 @@
         </w:tc>
       </w:tr>
       <w:tr>
-        <w:tblPrEx>
-          <w:tblCellMar>
-            <w:top w:w="0" w:type="dxa"/>
-            <w:bottom w:w="0" w:type="dxa"/>
-          </w:tblCellMar>
-        </w:tblPrEx>
         <w:trPr>
           <w:cantSplit/>
         </w:trPr>
@@ -9804,12 +9737,6 @@
         </w:tc>
       </w:tr>
       <w:tr>
-        <w:tblPrEx>
-          <w:tblCellMar>
-            <w:top w:w="0" w:type="dxa"/>
-            <w:bottom w:w="0" w:type="dxa"/>
-          </w:tblCellMar>
-        </w:tblPrEx>
         <w:trPr>
           <w:cantSplit/>
         </w:trPr>
@@ -9934,12 +9861,6 @@
         <w:gridCol w:w="2350"/>
       </w:tblGrid>
       <w:tr>
-        <w:tblPrEx>
-          <w:tblCellMar>
-            <w:top w:w="0" w:type="dxa"/>
-            <w:bottom w:w="0" w:type="dxa"/>
-          </w:tblCellMar>
-        </w:tblPrEx>
         <w:trPr>
           <w:tblHeader/>
         </w:trPr>
@@ -10201,12 +10122,6 @@
         </w:tc>
       </w:tr>
       <w:tr>
-        <w:tblPrEx>
-          <w:tblCellMar>
-            <w:top w:w="0" w:type="dxa"/>
-            <w:bottom w:w="0" w:type="dxa"/>
-          </w:tblCellMar>
-        </w:tblPrEx>
         <w:trPr>
           <w:cantSplit/>
         </w:trPr>
@@ -10425,12 +10340,6 @@
         </w:tc>
       </w:tr>
       <w:tr>
-        <w:tblPrEx>
-          <w:tblCellMar>
-            <w:top w:w="0" w:type="dxa"/>
-            <w:bottom w:w="0" w:type="dxa"/>
-          </w:tblCellMar>
-        </w:tblPrEx>
         <w:trPr>
           <w:cantSplit/>
         </w:trPr>
@@ -10652,12 +10561,6 @@
         </w:tc>
       </w:tr>
       <w:tr>
-        <w:tblPrEx>
-          <w:tblCellMar>
-            <w:top w:w="0" w:type="dxa"/>
-            <w:bottom w:w="0" w:type="dxa"/>
-          </w:tblCellMar>
-        </w:tblPrEx>
         <w:trPr>
           <w:cantSplit/>
         </w:trPr>
@@ -10871,12 +10774,6 @@
         </w:tc>
       </w:tr>
       <w:tr>
-        <w:tblPrEx>
-          <w:tblCellMar>
-            <w:top w:w="0" w:type="dxa"/>
-            <w:bottom w:w="0" w:type="dxa"/>
-          </w:tblCellMar>
-        </w:tblPrEx>
         <w:trPr>
           <w:cantSplit/>
         </w:trPr>
@@ -11100,12 +10997,6 @@
         </w:tc>
       </w:tr>
       <w:tr>
-        <w:tblPrEx>
-          <w:tblCellMar>
-            <w:top w:w="0" w:type="dxa"/>
-            <w:bottom w:w="0" w:type="dxa"/>
-          </w:tblCellMar>
-        </w:tblPrEx>
         <w:trPr>
           <w:cantSplit/>
         </w:trPr>
@@ -11319,12 +11210,6 @@
         </w:tc>
       </w:tr>
       <w:tr>
-        <w:tblPrEx>
-          <w:tblCellMar>
-            <w:top w:w="0" w:type="dxa"/>
-            <w:bottom w:w="0" w:type="dxa"/>
-          </w:tblCellMar>
-        </w:tblPrEx>
         <w:trPr>
           <w:cantSplit/>
         </w:trPr>
@@ -11546,12 +11431,6 @@
         </w:tc>
       </w:tr>
       <w:tr>
-        <w:tblPrEx>
-          <w:tblCellMar>
-            <w:top w:w="0" w:type="dxa"/>
-            <w:bottom w:w="0" w:type="dxa"/>
-          </w:tblCellMar>
-        </w:tblPrEx>
         <w:trPr>
           <w:cantSplit/>
         </w:trPr>
@@ -11800,12 +11679,6 @@
         <w:gridCol w:w="9638"/>
       </w:tblGrid>
       <w:tr>
-        <w:tblPrEx>
-          <w:tblCellMar>
-            <w:top w:w="0" w:type="dxa"/>
-            <w:bottom w:w="0" w:type="dxa"/>
-          </w:tblCellMar>
-        </w:tblPrEx>
         <w:tc>
           <w:tcPr>
             <w:tcW w:w="9638" w:type="dxa"/>
@@ -12115,12 +11988,6 @@
         <w:gridCol w:w="3438"/>
       </w:tblGrid>
       <w:tr>
-        <w:tblPrEx>
-          <w:tblCellMar>
-            <w:top w:w="0" w:type="dxa"/>
-            <w:bottom w:w="0" w:type="dxa"/>
-          </w:tblCellMar>
-        </w:tblPrEx>
         <w:trPr>
           <w:tblHeader/>
         </w:trPr>
@@ -12286,12 +12153,6 @@
         </w:tc>
       </w:tr>
       <w:tr>
-        <w:tblPrEx>
-          <w:tblCellMar>
-            <w:top w:w="0" w:type="dxa"/>
-            <w:bottom w:w="0" w:type="dxa"/>
-          </w:tblCellMar>
-        </w:tblPrEx>
         <w:trPr>
           <w:cantSplit/>
         </w:trPr>
@@ -12427,12 +12288,6 @@
         </w:tc>
       </w:tr>
       <w:tr>
-        <w:tblPrEx>
-          <w:tblCellMar>
-            <w:top w:w="0" w:type="dxa"/>
-            <w:bottom w:w="0" w:type="dxa"/>
-          </w:tblCellMar>
-        </w:tblPrEx>
         <w:trPr>
           <w:cantSplit/>
         </w:trPr>
@@ -12573,12 +12428,6 @@
         </w:tc>
       </w:tr>
       <w:tr>
-        <w:tblPrEx>
-          <w:tblCellMar>
-            <w:top w:w="0" w:type="dxa"/>
-            <w:bottom w:w="0" w:type="dxa"/>
-          </w:tblCellMar>
-        </w:tblPrEx>
         <w:trPr>
           <w:cantSplit/>
         </w:trPr>
@@ -12714,12 +12563,6 @@
         </w:tc>
       </w:tr>
       <w:tr>
-        <w:tblPrEx>
-          <w:tblCellMar>
-            <w:top w:w="0" w:type="dxa"/>
-            <w:bottom w:w="0" w:type="dxa"/>
-          </w:tblCellMar>
-        </w:tblPrEx>
         <w:trPr>
           <w:cantSplit/>
         </w:trPr>
@@ -12860,12 +12703,6 @@
         </w:tc>
       </w:tr>
       <w:tr>
-        <w:tblPrEx>
-          <w:tblCellMar>
-            <w:top w:w="0" w:type="dxa"/>
-            <w:bottom w:w="0" w:type="dxa"/>
-          </w:tblCellMar>
-        </w:tblPrEx>
         <w:trPr>
           <w:cantSplit/>
         </w:trPr>
@@ -13001,12 +12838,6 @@
         </w:tc>
       </w:tr>
       <w:tr>
-        <w:tblPrEx>
-          <w:tblCellMar>
-            <w:top w:w="0" w:type="dxa"/>
-            <w:bottom w:w="0" w:type="dxa"/>
-          </w:tblCellMar>
-        </w:tblPrEx>
         <w:trPr>
           <w:cantSplit/>
         </w:trPr>
@@ -13147,12 +12978,6 @@
         </w:tc>
       </w:tr>
       <w:tr>
-        <w:tblPrEx>
-          <w:tblCellMar>
-            <w:top w:w="0" w:type="dxa"/>
-            <w:bottom w:w="0" w:type="dxa"/>
-          </w:tblCellMar>
-        </w:tblPrEx>
         <w:trPr>
           <w:cantSplit/>
         </w:trPr>
@@ -13347,216 +13172,55 @@
     </w:p>
     <w:tbl>
       <w:tblPr>
-        <w:tblW w:w="9638" w:type="dxa"/>
-        <w:tblInd w:w="90" w:type="dxa"/>
-        <w:tblBorders>
-          <w:top w:val="single" w:sz="4" w:space="0" w:color="auto"/>
-          <w:left w:val="single" w:sz="4" w:space="0" w:color="auto"/>
-          <w:bottom w:val="single" w:sz="4" w:space="0" w:color="auto"/>
-          <w:right w:val="single" w:sz="4" w:space="0" w:color="auto"/>
-          <w:insideH w:val="single" w:sz="4" w:space="0" w:color="auto"/>
-          <w:insideV w:val="single" w:sz="4" w:space="0" w:color="auto"/>
-        </w:tblBorders>
-        <w:tblCellMar>
-          <w:left w:w="10" w:type="dxa"/>
-          <w:right w:w="10" w:type="dxa"/>
-        </w:tblCellMar>
-        <w:tblLook w:val="0000" w:firstRow="0" w:lastRow="0" w:firstColumn="0" w:lastColumn="0" w:noHBand="0" w:noVBand="0"/>
+        <w:tblStyle w:val="TableGrid"/>
+        <w:tblW w:w="0" w:type="auto"/>
+        <w:tblLook w:val="04A0" w:firstRow="1" w:lastRow="0" w:firstColumn="1" w:lastColumn="0" w:noHBand="0" w:noVBand="1"/>
       </w:tblPr>
       <w:tblGrid>
-        <w:gridCol w:w="2800"/>
-        <w:gridCol w:w="6838"/>
+        <w:gridCol w:w="4927"/>
+        <w:gridCol w:w="4927"/>
       </w:tblGrid>
       <w:tr>
-        <w:tblPrEx>
-          <w:tblCellMar>
-            <w:top w:w="0" w:type="dxa"/>
-            <w:bottom w:w="0" w:type="dxa"/>
-          </w:tblCellMar>
-        </w:tblPrEx>
-        <w:trPr>
-          <w:tblHeader/>
-        </w:trPr>
-        <w:tc>
-          <w:tcPr>
-            <w:tcW w:w="2800" w:type="dxa"/>
-            <w:tcBorders>
-              <w:top w:val="single" w:sz="4" w:space="0" w:color="8A9BB0"/>
-              <w:left w:val="single" w:sz="4" w:space="0" w:color="8A9BB0"/>
-              <w:bottom w:val="single" w:sz="4" w:space="0" w:color="8A9BB0"/>
-              <w:right w:val="single" w:sz="4" w:space="0" w:color="8A9BB0"/>
-            </w:tcBorders>
-            <w:shd w:val="clear" w:color="auto" w:fill="1F3A5F"/>
-            <w:tcMar>
-              <w:top w:w="60" w:type="dxa"/>
-              <w:left w:w="100" w:type="dxa"/>
-              <w:bottom w:w="60" w:type="dxa"/>
-              <w:right w:w="100" w:type="dxa"/>
-            </w:tcMar>
-            <w:vAlign w:val="center"/>
-          </w:tcPr>
-          <w:p>
-            <w:pPr>
-              <w:jc w:val="center"/>
-            </w:pPr>
-            <w:r>
-              <w:rPr>
-                <w:b/>
-                <w:bCs/>
-                <w:color w:val="FFFFFF"/>
-              </w:rPr>
-              <w:t>Required Evidence</w:t>
-            </w:r>
-          </w:p>
-        </w:tc>
-        <w:tc>
-          <w:tcPr>
-            <w:tcW w:w="6838" w:type="dxa"/>
-            <w:tcBorders>
-              <w:top w:val="single" w:sz="4" w:space="0" w:color="8A9BB0"/>
-              <w:left w:val="single" w:sz="4" w:space="0" w:color="8A9BB0"/>
-              <w:bottom w:val="single" w:sz="4" w:space="0" w:color="8A9BB0"/>
-              <w:right w:val="single" w:sz="4" w:space="0" w:color="8A9BB0"/>
-            </w:tcBorders>
-            <w:shd w:val="clear" w:color="auto" w:fill="1F3A5F"/>
-            <w:tcMar>
-              <w:top w:w="60" w:type="dxa"/>
-              <w:left w:w="100" w:type="dxa"/>
-              <w:bottom w:w="60" w:type="dxa"/>
-              <w:right w:w="100" w:type="dxa"/>
-            </w:tcMar>
-            <w:vAlign w:val="center"/>
-          </w:tcPr>
-          <w:p>
-            <w:pPr>
-              <w:jc w:val="center"/>
-            </w:pPr>
-            <w:r>
-              <w:rPr>
-                <w:b/>
-                <w:bCs/>
-                <w:color w:val="FFFFFF"/>
-              </w:rPr>
-              <w:t>What to include</w:t>
+        <w:tc>
+          <w:tcPr>
+            <w:tcW w:w="4927" w:type="dxa"/>
+          </w:tcPr>
+          <w:p>
+            <w:pPr>
+              <w:spacing w:after="120"/>
+            </w:pPr>
+            <w:proofErr w:type="spellStart"/>
+            <w:r>
+              <w:t>Github</w:t>
+            </w:r>
+            <w:proofErr w:type="spellEnd"/>
+            <w:r>
+              <w:t xml:space="preserve"> repository</w:t>
+            </w:r>
+          </w:p>
+        </w:tc>
+        <w:tc>
+          <w:tcPr>
+            <w:tcW w:w="4927" w:type="dxa"/>
+          </w:tcPr>
+          <w:p>
+            <w:pPr>
+              <w:spacing w:after="120"/>
+            </w:pPr>
+            <w:r>
+              <w:t>PROG101_Assignment_Henry-MopehthomAS_905006240</w:t>
             </w:r>
           </w:p>
         </w:tc>
       </w:tr>
       <w:tr>
-        <w:tblPrEx>
-          <w:tblCellMar>
-            <w:top w:w="0" w:type="dxa"/>
-            <w:bottom w:w="0" w:type="dxa"/>
-          </w:tblCellMar>
-        </w:tblPrEx>
-        <w:trPr>
-          <w:cantSplit/>
-        </w:trPr>
-        <w:tc>
-          <w:tcPr>
-            <w:tcW w:w="2800" w:type="dxa"/>
-            <w:tcBorders>
-              <w:top w:val="single" w:sz="4" w:space="0" w:color="8A9BB0"/>
-              <w:left w:val="single" w:sz="4" w:space="0" w:color="8A9BB0"/>
-              <w:bottom w:val="single" w:sz="4" w:space="0" w:color="8A9BB0"/>
-              <w:right w:val="single" w:sz="4" w:space="0" w:color="8A9BB0"/>
-            </w:tcBorders>
-            <w:tcMar>
-              <w:top w:w="60" w:type="dxa"/>
-              <w:left w:w="100" w:type="dxa"/>
-              <w:bottom w:w="60" w:type="dxa"/>
-              <w:right w:w="100" w:type="dxa"/>
-            </w:tcMar>
-            <w:vAlign w:val="center"/>
-          </w:tcPr>
-          <w:p>
-            <w:pPr>
-              <w:jc w:val="left"/>
-            </w:pPr>
-            <w:proofErr w:type="spellStart"/>
-            <w:r>
-              <w:t>GitHub</w:t>
-            </w:r>
-            <w:proofErr w:type="spellEnd"/>
-            <w:r>
-              <w:t xml:space="preserve"> Repository</w:t>
-            </w:r>
-          </w:p>
-        </w:tc>
-        <w:tc>
-          <w:tcPr>
-            <w:tcW w:w="6838" w:type="dxa"/>
-            <w:tcBorders>
-              <w:top w:val="single" w:sz="4" w:space="0" w:color="8A9BB0"/>
-              <w:left w:val="single" w:sz="4" w:space="0" w:color="8A9BB0"/>
-              <w:bottom w:val="single" w:sz="4" w:space="0" w:color="8A9BB0"/>
-              <w:right w:val="single" w:sz="4" w:space="0" w:color="8A9BB0"/>
-            </w:tcBorders>
-            <w:tcMar>
-              <w:top w:w="60" w:type="dxa"/>
-              <w:left w:w="100" w:type="dxa"/>
-              <w:bottom w:w="60" w:type="dxa"/>
-              <w:right w:w="100" w:type="dxa"/>
-            </w:tcMar>
-            <w:vAlign w:val="center"/>
-          </w:tcPr>
-          <w:p>
-            <w:pPr>
-              <w:jc w:val="left"/>
-            </w:pPr>
-            <w:r>
-              <w:t>Repository name: PROG101_Assignment1_[</w:t>
-            </w:r>
-            <w:proofErr w:type="spellStart"/>
-            <w:r>
-              <w:t>StudentName</w:t>
-            </w:r>
-            <w:proofErr w:type="spellEnd"/>
-            <w:r>
-              <w:t>]_[</w:t>
-            </w:r>
-            <w:proofErr w:type="spellStart"/>
-            <w:r>
-              <w:t>StudentID</w:t>
-            </w:r>
-            <w:proofErr w:type="spellEnd"/>
-            <w:r>
-              <w:t>]</w:t>
-            </w:r>
-          </w:p>
-        </w:tc>
-      </w:tr>
-      <w:tr>
-        <w:tblPrEx>
-          <w:tblCellMar>
-            <w:top w:w="0" w:type="dxa"/>
-            <w:bottom w:w="0" w:type="dxa"/>
-          </w:tblCellMar>
-        </w:tblPrEx>
-        <w:trPr>
-          <w:cantSplit/>
-        </w:trPr>
-        <w:tc>
-          <w:tcPr>
-            <w:tcW w:w="2800" w:type="dxa"/>
-            <w:tcBorders>
-              <w:top w:val="single" w:sz="4" w:space="0" w:color="8A9BB0"/>
-              <w:left w:val="single" w:sz="4" w:space="0" w:color="8A9BB0"/>
-              <w:bottom w:val="single" w:sz="4" w:space="0" w:color="8A9BB0"/>
-              <w:right w:val="single" w:sz="4" w:space="0" w:color="8A9BB0"/>
-            </w:tcBorders>
-            <w:shd w:val="clear" w:color="auto" w:fill="F2F6FB"/>
-            <w:tcMar>
-              <w:top w:w="60" w:type="dxa"/>
-              <w:left w:w="100" w:type="dxa"/>
-              <w:bottom w:w="60" w:type="dxa"/>
-              <w:right w:w="100" w:type="dxa"/>
-            </w:tcMar>
-            <w:vAlign w:val="center"/>
-          </w:tcPr>
-          <w:p>
-            <w:pPr>
-              <w:jc w:val="left"/>
+        <w:tc>
+          <w:tcPr>
+            <w:tcW w:w="4927" w:type="dxa"/>
+          </w:tcPr>
+          <w:p>
+            <w:pPr>
+              <w:spacing w:after="120"/>
             </w:pPr>
             <w:r>
               <w:t>Repository URL</w:t>
@@ -13565,256 +13229,14 @@
         </w:tc>
         <w:tc>
           <w:tcPr>
-            <w:tcW w:w="6838" w:type="dxa"/>
-            <w:tcBorders>
-              <w:top w:val="single" w:sz="4" w:space="0" w:color="8A9BB0"/>
-              <w:left w:val="single" w:sz="4" w:space="0" w:color="8A9BB0"/>
-              <w:bottom w:val="single" w:sz="4" w:space="0" w:color="8A9BB0"/>
-              <w:right w:val="single" w:sz="4" w:space="0" w:color="8A9BB0"/>
-            </w:tcBorders>
-            <w:shd w:val="clear" w:color="auto" w:fill="F2F6FB"/>
-            <w:tcMar>
-              <w:top w:w="60" w:type="dxa"/>
-              <w:left w:w="100" w:type="dxa"/>
-              <w:bottom w:w="60" w:type="dxa"/>
-              <w:right w:w="100" w:type="dxa"/>
-            </w:tcMar>
-            <w:vAlign w:val="center"/>
-          </w:tcPr>
-          <w:p>
-            <w:pPr>
-              <w:jc w:val="left"/>
-            </w:pPr>
-            <w:r>
-              <w:t>https://github.com/[your-username]/PROG101_Assignment1_[StudentName]_[StudentID]</w:t>
-            </w:r>
-          </w:p>
-        </w:tc>
-      </w:tr>
-      <w:tr>
-        <w:tblPrEx>
-          <w:tblCellMar>
-            <w:top w:w="0" w:type="dxa"/>
-            <w:bottom w:w="0" w:type="dxa"/>
-          </w:tblCellMar>
-        </w:tblPrEx>
-        <w:trPr>
-          <w:cantSplit/>
-        </w:trPr>
-        <w:tc>
-          <w:tcPr>
-            <w:tcW w:w="2800" w:type="dxa"/>
-            <w:tcBorders>
-              <w:top w:val="single" w:sz="4" w:space="0" w:color="8A9BB0"/>
-              <w:left w:val="single" w:sz="4" w:space="0" w:color="8A9BB0"/>
-              <w:bottom w:val="single" w:sz="4" w:space="0" w:color="8A9BB0"/>
-              <w:right w:val="single" w:sz="4" w:space="0" w:color="8A9BB0"/>
-            </w:tcBorders>
-            <w:tcMar>
-              <w:top w:w="60" w:type="dxa"/>
-              <w:left w:w="100" w:type="dxa"/>
-              <w:bottom w:w="60" w:type="dxa"/>
-              <w:right w:w="100" w:type="dxa"/>
-            </w:tcMar>
-            <w:vAlign w:val="center"/>
-          </w:tcPr>
-          <w:p>
-            <w:pPr>
-              <w:jc w:val="left"/>
-            </w:pPr>
-            <w:proofErr w:type="spellStart"/>
-            <w:r>
-              <w:t>Git</w:t>
-            </w:r>
-            <w:proofErr w:type="spellEnd"/>
-            <w:r>
-              <w:t xml:space="preserve"> Commit History</w:t>
-            </w:r>
-          </w:p>
-        </w:tc>
-        <w:tc>
-          <w:tcPr>
-            <w:tcW w:w="6838" w:type="dxa"/>
-            <w:tcBorders>
-              <w:top w:val="single" w:sz="4" w:space="0" w:color="8A9BB0"/>
-              <w:left w:val="single" w:sz="4" w:space="0" w:color="8A9BB0"/>
-              <w:bottom w:val="single" w:sz="4" w:space="0" w:color="8A9BB0"/>
-              <w:right w:val="single" w:sz="4" w:space="0" w:color="8A9BB0"/>
-            </w:tcBorders>
-            <w:tcMar>
-              <w:top w:w="60" w:type="dxa"/>
-              <w:left w:w="100" w:type="dxa"/>
-              <w:bottom w:w="60" w:type="dxa"/>
-              <w:right w:w="100" w:type="dxa"/>
-            </w:tcMar>
-            <w:vAlign w:val="center"/>
-          </w:tcPr>
-          <w:p>
-            <w:pPr>
-              <w:jc w:val="left"/>
-            </w:pPr>
-            <w:r>
-              <w:t xml:space="preserve">Screenshot of the commits page (or </w:t>
-            </w:r>
-            <w:proofErr w:type="spellStart"/>
-            <w:r>
-              <w:t>git</w:t>
-            </w:r>
-            <w:proofErr w:type="spellEnd"/>
-            <w:r>
-              <w:t xml:space="preserve"> log --</w:t>
-            </w:r>
-            <w:proofErr w:type="spellStart"/>
-            <w:r>
-              <w:t>oneline</w:t>
-            </w:r>
-            <w:proofErr w:type="spellEnd"/>
-            <w:r>
-              <w:t>) showing regular commits made while you worked.</w:t>
-            </w:r>
-          </w:p>
-        </w:tc>
-      </w:tr>
-      <w:tr>
-        <w:tblPrEx>
-          <w:tblCellMar>
-            <w:top w:w="0" w:type="dxa"/>
-            <w:bottom w:w="0" w:type="dxa"/>
-          </w:tblCellMar>
-        </w:tblPrEx>
-        <w:trPr>
-          <w:cantSplit/>
-        </w:trPr>
-        <w:tc>
-          <w:tcPr>
-            <w:tcW w:w="2800" w:type="dxa"/>
-            <w:tcBorders>
-              <w:top w:val="single" w:sz="4" w:space="0" w:color="8A9BB0"/>
-              <w:left w:val="single" w:sz="4" w:space="0" w:color="8A9BB0"/>
-              <w:bottom w:val="single" w:sz="4" w:space="0" w:color="8A9BB0"/>
-              <w:right w:val="single" w:sz="4" w:space="0" w:color="8A9BB0"/>
-            </w:tcBorders>
-            <w:shd w:val="clear" w:color="auto" w:fill="F2F6FB"/>
-            <w:tcMar>
-              <w:top w:w="60" w:type="dxa"/>
-              <w:left w:w="100" w:type="dxa"/>
-              <w:bottom w:w="60" w:type="dxa"/>
-              <w:right w:w="100" w:type="dxa"/>
-            </w:tcMar>
-            <w:vAlign w:val="center"/>
-          </w:tcPr>
-          <w:p>
-            <w:pPr>
-              <w:jc w:val="left"/>
-            </w:pPr>
-            <w:r>
-              <w:t>README.md</w:t>
-            </w:r>
-          </w:p>
-        </w:tc>
-        <w:tc>
-          <w:tcPr>
-            <w:tcW w:w="6838" w:type="dxa"/>
-            <w:tcBorders>
-              <w:top w:val="single" w:sz="4" w:space="0" w:color="8A9BB0"/>
-              <w:left w:val="single" w:sz="4" w:space="0" w:color="8A9BB0"/>
-              <w:bottom w:val="single" w:sz="4" w:space="0" w:color="8A9BB0"/>
-              <w:right w:val="single" w:sz="4" w:space="0" w:color="8A9BB0"/>
-            </w:tcBorders>
-            <w:shd w:val="clear" w:color="auto" w:fill="F2F6FB"/>
-            <w:tcMar>
-              <w:top w:w="60" w:type="dxa"/>
-              <w:left w:w="100" w:type="dxa"/>
-              <w:bottom w:w="60" w:type="dxa"/>
-              <w:right w:w="100" w:type="dxa"/>
-            </w:tcMar>
-            <w:vAlign w:val="center"/>
-          </w:tcPr>
-          <w:p>
-            <w:pPr>
-              <w:jc w:val="left"/>
-            </w:pPr>
-            <w:r>
-              <w:t xml:space="preserve">Screenshot or copy of the README (project title, problem, SDG, files list, how to view, </w:t>
-            </w:r>
-            <w:proofErr w:type="spellStart"/>
-            <w:r>
-              <w:t>licence</w:t>
-            </w:r>
-            <w:proofErr w:type="spellEnd"/>
-            <w:r>
-              <w:t>).</w:t>
-            </w:r>
-          </w:p>
-        </w:tc>
-      </w:tr>
-      <w:tr>
-        <w:tblPrEx>
-          <w:tblCellMar>
-            <w:top w:w="0" w:type="dxa"/>
-            <w:bottom w:w="0" w:type="dxa"/>
-          </w:tblCellMar>
-        </w:tblPrEx>
-        <w:trPr>
-          <w:cantSplit/>
-        </w:trPr>
-        <w:tc>
-          <w:tcPr>
-            <w:tcW w:w="2800" w:type="dxa"/>
-            <w:tcBorders>
-              <w:top w:val="single" w:sz="4" w:space="0" w:color="8A9BB0"/>
-              <w:left w:val="single" w:sz="4" w:space="0" w:color="8A9BB0"/>
-              <w:bottom w:val="single" w:sz="4" w:space="0" w:color="8A9BB0"/>
-              <w:right w:val="single" w:sz="4" w:space="0" w:color="8A9BB0"/>
-            </w:tcBorders>
-            <w:tcMar>
-              <w:top w:w="60" w:type="dxa"/>
-              <w:left w:w="100" w:type="dxa"/>
-              <w:bottom w:w="60" w:type="dxa"/>
-              <w:right w:w="100" w:type="dxa"/>
-            </w:tcMar>
-            <w:vAlign w:val="center"/>
-          </w:tcPr>
-          <w:p>
-            <w:pPr>
-              <w:jc w:val="left"/>
-            </w:pPr>
-            <w:r>
-              <w:t>Repository Screenshot</w:t>
-            </w:r>
-          </w:p>
-        </w:tc>
-        <w:tc>
-          <w:tcPr>
-            <w:tcW w:w="6838" w:type="dxa"/>
-            <w:tcBorders>
-              <w:top w:val="single" w:sz="4" w:space="0" w:color="8A9BB0"/>
-              <w:left w:val="single" w:sz="4" w:space="0" w:color="8A9BB0"/>
-              <w:bottom w:val="single" w:sz="4" w:space="0" w:color="8A9BB0"/>
-              <w:right w:val="single" w:sz="4" w:space="0" w:color="8A9BB0"/>
-            </w:tcBorders>
-            <w:tcMar>
-              <w:top w:w="60" w:type="dxa"/>
-              <w:left w:w="100" w:type="dxa"/>
-              <w:bottom w:w="60" w:type="dxa"/>
-              <w:right w:w="100" w:type="dxa"/>
-            </w:tcMar>
-            <w:vAlign w:val="center"/>
-          </w:tcPr>
-          <w:p>
-            <w:pPr>
-              <w:jc w:val="left"/>
-            </w:pPr>
-            <w:r>
-              <w:t xml:space="preserve">Screenshot of the main repository page showing the Report, Flowcharts, </w:t>
-            </w:r>
-            <w:proofErr w:type="spellStart"/>
-            <w:r>
-              <w:t>Pseudocode</w:t>
-            </w:r>
-            <w:proofErr w:type="spellEnd"/>
-            <w:r>
-              <w:t xml:space="preserve"> and README.md files.</w:t>
+            <w:tcW w:w="4927" w:type="dxa"/>
+          </w:tcPr>
+          <w:p>
+            <w:pPr>
+              <w:spacing w:after="120"/>
+            </w:pPr>
+            <w:r>
+              <w:t>https://github.com/henrymopehthomas18-crypto/PROG101_Assignment1_Henry-Mopehthomas_905006240</w:t>
             </w:r>
           </w:p>
         </w:tc>
@@ -13822,8 +13244,57 @@
     </w:tbl>
     <w:p>
       <w:pPr>
-        <w:spacing w:after="60"/>
+        <w:spacing w:after="120"/>
       </w:pPr>
+      <w:r>
+        <w:tab/>
+      </w:r>
+      <w:r>
+        <w:rPr>
+          <w:noProof/>
+        </w:rPr>
+        <w:drawing>
+          <wp:inline distT="0" distB="0" distL="0" distR="0" wp14:anchorId="1C472387" wp14:editId="702ABC5F">
+            <wp:extent cx="6120130" cy="4590415"/>
+            <wp:effectExtent l="0" t="0" r="0" b="635"/>
+            <wp:docPr id="5" name="Picture 5"/>
+            <wp:cNvGraphicFramePr>
+              <a:graphicFrameLocks xmlns:a="http://schemas.openxmlformats.org/drawingml/2006/main" noChangeAspect="1"/>
+            </wp:cNvGraphicFramePr>
+            <a:graphic xmlns:a="http://schemas.openxmlformats.org/drawingml/2006/main">
+              <a:graphicData uri="http://schemas.openxmlformats.org/drawingml/2006/picture">
+                <pic:pic xmlns:pic="http://schemas.openxmlformats.org/drawingml/2006/picture">
+                  <pic:nvPicPr>
+                    <pic:cNvPr id="0" name="repo.jpeg"/>
+                    <pic:cNvPicPr/>
+                  </pic:nvPicPr>
+                  <pic:blipFill>
+                    <a:blip r:embed="rId15">
+                      <a:extLst>
+                        <a:ext uri="{28A0092B-C50C-407E-A947-70E740481C1C}">
+                          <a14:useLocalDpi xmlns:a14="http://schemas.microsoft.com/office/drawing/2010/main" val="0"/>
+                        </a:ext>
+                      </a:extLst>
+                    </a:blip>
+                    <a:stretch>
+                      <a:fillRect/>
+                    </a:stretch>
+                  </pic:blipFill>
+                  <pic:spPr>
+                    <a:xfrm>
+                      <a:off x="0" y="0"/>
+                      <a:ext cx="6120130" cy="4590415"/>
+                    </a:xfrm>
+                    <a:prstGeom prst="rect">
+                      <a:avLst/>
+                    </a:prstGeom>
+                  </pic:spPr>
+                </pic:pic>
+              </a:graphicData>
+            </a:graphic>
+          </wp:inline>
+        </w:drawing>
+      </w:r>
     </w:p>
     <w:p>
       <w:pPr>
@@ -13858,12 +13329,6 @@
         <w:gridCol w:w="8038"/>
       </w:tblGrid>
       <w:tr>
-        <w:tblPrEx>
-          <w:tblCellMar>
-            <w:top w:w="0" w:type="dxa"/>
-            <w:bottom w:w="0" w:type="dxa"/>
-          </w:tblCellMar>
-        </w:tblPrEx>
         <w:trPr>
           <w:tblHeader/>
         </w:trPr>
@@ -13933,12 +13398,6 @@
         </w:tc>
       </w:tr>
       <w:tr>
-        <w:tblPrEx>
-          <w:tblCellMar>
-            <w:top w:w="0" w:type="dxa"/>
-            <w:bottom w:w="0" w:type="dxa"/>
-          </w:tblCellMar>
-        </w:tblPrEx>
         <w:trPr>
           <w:cantSplit/>
         </w:trPr>
@@ -13996,12 +13455,6 @@
         </w:tc>
       </w:tr>
       <w:tr>
-        <w:tblPrEx>
-          <w:tblCellMar>
-            <w:top w:w="0" w:type="dxa"/>
-            <w:bottom w:w="0" w:type="dxa"/>
-          </w:tblCellMar>
-        </w:tblPrEx>
         <w:trPr>
           <w:cantSplit/>
         </w:trPr>
@@ -14061,12 +13514,6 @@
         </w:tc>
       </w:tr>
       <w:tr>
-        <w:tblPrEx>
-          <w:tblCellMar>
-            <w:top w:w="0" w:type="dxa"/>
-            <w:bottom w:w="0" w:type="dxa"/>
-          </w:tblCellMar>
-        </w:tblPrEx>
         <w:trPr>
           <w:cantSplit/>
         </w:trPr>
@@ -14124,12 +13571,6 @@
         </w:tc>
       </w:tr>
       <w:tr>
-        <w:tblPrEx>
-          <w:tblCellMar>
-            <w:top w:w="0" w:type="dxa"/>
-            <w:bottom w:w="0" w:type="dxa"/>
-          </w:tblCellMar>
-        </w:tblPrEx>
         <w:trPr>
           <w:cantSplit/>
         </w:trPr>
@@ -14197,12 +13638,6 @@
         </w:tc>
       </w:tr>
       <w:tr>
-        <w:tblPrEx>
-          <w:tblCellMar>
-            <w:top w:w="0" w:type="dxa"/>
-            <w:bottom w:w="0" w:type="dxa"/>
-          </w:tblCellMar>
-        </w:tblPrEx>
         <w:trPr>
           <w:cantSplit/>
         </w:trPr>
@@ -14260,12 +13695,6 @@
         </w:tc>
       </w:tr>
       <w:tr>
-        <w:tblPrEx>
-          <w:tblCellMar>
-            <w:top w:w="0" w:type="dxa"/>
-            <w:bottom w:w="0" w:type="dxa"/>
-          </w:tblCellMar>
-        </w:tblPrEx>
         <w:trPr>
           <w:cantSplit/>
         </w:trPr>
@@ -14333,12 +13762,6 @@
         </w:tc>
       </w:tr>
       <w:tr>
-        <w:tblPrEx>
-          <w:tblCellMar>
-            <w:top w:w="0" w:type="dxa"/>
-            <w:bottom w:w="0" w:type="dxa"/>
-          </w:tblCellMar>
-        </w:tblPrEx>
         <w:trPr>
           <w:cantSplit/>
         </w:trPr>
@@ -14396,12 +13819,6 @@
         </w:tc>
       </w:tr>
       <w:tr>
-        <w:tblPrEx>
-          <w:tblCellMar>
-            <w:top w:w="0" w:type="dxa"/>
-            <w:bottom w:w="0" w:type="dxa"/>
-          </w:tblCellMar>
-        </w:tblPrEx>
         <w:trPr>
           <w:cantSplit/>
         </w:trPr>
@@ -14428,6 +13845,7 @@
               <w:jc w:val="center"/>
             </w:pPr>
             <w:r>
+              <w:lastRenderedPageBreak/>
               <w:t>8</w:t>
             </w:r>
           </w:p>
@@ -14660,8 +14078,8 @@
       </w:r>
     </w:p>
     <w:sectPr>
-      <w:headerReference w:type="default" r:id="rId10"/>
-      <w:footerReference w:type="default" r:id="rId11"/>
+      <w:headerReference w:type="default" r:id="rId16"/>
+      <w:footerReference w:type="default" r:id="rId17"/>
       <w:pgSz w:w="11906" w:h="16838"/>
       <w:pgMar w:top="1134" w:right="1134" w:bottom="1134" w:left="1134" w:header="708" w:footer="708" w:gutter="0"/>
       <w:cols w:space="720"/>
@@ -14731,7 +14149,7 @@
           <w:rPr>
             <w:noProof/>
           </w:rPr>
-          <w:t>10</w:t>
+          <w:t>21</w:t>
         </w:r>
         <w:r>
           <w:rPr>
@@ -15414,6 +14832,32 @@
     <w:uiPriority w:val="99"/>
     <w:rsid w:val="00EB7208"/>
   </w:style>
+  <w:style w:type="table" w:styleId="TableGrid">
+    <w:name w:val="Table Grid"/>
+    <w:basedOn w:val="TableNormal"/>
+    <w:uiPriority w:val="59"/>
+    <w:rsid w:val="00127424"/>
+    <w:pPr>
+      <w:spacing w:line="240" w:lineRule="auto"/>
+    </w:pPr>
+    <w:tblPr>
+      <w:tblInd w:w="0" w:type="dxa"/>
+      <w:tblBorders>
+        <w:top w:val="single" w:sz="4" w:space="0" w:color="auto"/>
+        <w:left w:val="single" w:sz="4" w:space="0" w:color="auto"/>
+        <w:bottom w:val="single" w:sz="4" w:space="0" w:color="auto"/>
+        <w:right w:val="single" w:sz="4" w:space="0" w:color="auto"/>
+        <w:insideH w:val="single" w:sz="4" w:space="0" w:color="auto"/>
+        <w:insideV w:val="single" w:sz="4" w:space="0" w:color="auto"/>
+      </w:tblBorders>
+      <w:tblCellMar>
+        <w:top w:w="0" w:type="dxa"/>
+        <w:left w:w="108" w:type="dxa"/>
+        <w:bottom w:w="0" w:type="dxa"/>
+        <w:right w:w="108" w:type="dxa"/>
+      </w:tblCellMar>
+    </w:tblPr>
+  </w:style>
 </w:styles>
 </file>
 
@@ -15868,6 +15312,32 @@
     <w:uiPriority w:val="99"/>
     <w:rsid w:val="00EB7208"/>
   </w:style>
+  <w:style w:type="table" w:styleId="TableGrid">
+    <w:name w:val="Table Grid"/>
+    <w:basedOn w:val="TableNormal"/>
+    <w:uiPriority w:val="59"/>
+    <w:rsid w:val="00127424"/>
+    <w:pPr>
+      <w:spacing w:line="240" w:lineRule="auto"/>
+    </w:pPr>
+    <w:tblPr>
+      <w:tblInd w:w="0" w:type="dxa"/>
+      <w:tblBorders>
+        <w:top w:val="single" w:sz="4" w:space="0" w:color="auto"/>
+        <w:left w:val="single" w:sz="4" w:space="0" w:color="auto"/>
+        <w:bottom w:val="single" w:sz="4" w:space="0" w:color="auto"/>
+        <w:right w:val="single" w:sz="4" w:space="0" w:color="auto"/>
+        <w:insideH w:val="single" w:sz="4" w:space="0" w:color="auto"/>
+        <w:insideV w:val="single" w:sz="4" w:space="0" w:color="auto"/>
+      </w:tblBorders>
+      <w:tblCellMar>
+        <w:top w:w="0" w:type="dxa"/>
+        <w:left w:w="108" w:type="dxa"/>
+        <w:bottom w:w="0" w:type="dxa"/>
+        <w:right w:w="108" w:type="dxa"/>
+      </w:tblCellMar>
+    </w:tblPr>
+  </w:style>
 </w:styles>
 </file>
 

</xml_diff>